<commit_message>
Item autofill/search reads ITMMSTP; badge dropdown returns, active employees
REQSTN007S: ITEMSRCH now searches the ITMMSTP item master (every
inventory item findable, not just previously requisitioned), and ITEM
autofill takes description + coin year from the master with last-used
cost/retail/coin-date string from history (the master carries no
pricing); history-only fallback keeps legacy items working. BADGE is a
code-file list again, seeded with all 858 ACTIVE employees from the
employee tbl export; the grid's Badge # box gets its dropdown back
(focus opens, typing filters by badge or name, pick saves). Docs and
seed counts updated.

Co-Authored-By: Claude Fable 5 <noreply@anthropic.com>
Claude-Session: https://claude.ai/code/session_01SfunpdkVdapnCdtb2hWS9U
</commit_message>
<xml_diff>
--- a/ReqStation/docs/Requisition Material - Technical Reference.docx
+++ b/ReqStation/docs/Requisition Material - Technical Reference.docx
@@ -592,7 +592,7 @@
               <w:spacing w:after="0"/>
             </w:pPr>
             <w:r>
-              <w:t xml:space="preserve">The code file: all four dropdown lists in one table, keyed by CDTYPE + CDCODE — AREACODE (3), AREATYPE (16), NAMES (65), AUTHBY (6). "Authorization = None" is a REAL AUTHBY row (13k+ historical headers store that literal), sorts first, and is the natural default — nothing synthetic in the code.</w:t>
+              <w:t xml:space="preserve">The code file: all five dropdown lists in one table, keyed by CDTYPE + CDCODE — AREACODE (3), AREATYPE (16), NAMES (65), AUTHBY (6), BADGE (858 active employees: badge # = employee #, name in CDDESC). "Authorization = None" is a REAL AUTHBY row (13k+ historical headers store that literal), sorts first, and is the natural default — nothing synthetic in the code.</w:t>
             </w:r>
           </w:p>
         </w:tc>
@@ -1184,7 +1184,7 @@
               <w:spacing w:after="0"/>
             </w:pPr>
             <w:r>
-              <w:t xml:space="preserve">INTYPE picks the cursor: any code list from RQSCODEFLT; ITEM = most recent desc/coin date/cost/retail for a full item number; ITEMSRCH = type-ahead search, latest row per item via ROW_NUMBER(), first 12.</w:t>
+              <w:t xml:space="preserve">INTYPE picks the cursor: any code list from RQSCODEFLT; ITEM = autofill from the ITMMSTP item master (description, coin year) + last-used cost/retail from history, with history fallback for legacy items; ITEMSRCH = type-ahead over ITMMSTP, first 12, history-enriched.</w:t>
             </w:r>
           </w:p>
         </w:tc>

</xml_diff>

<commit_message>
Badge dropdown reads live from LSCPRDLIB/XEMPLOYP
REQSTN007S gets a BADGE cursor over the production employee file
(LEESTAT='A'): badge # + first/last name, name order - always current,
nothing to seed or maintain. The 858 seeded BADGE rows are removed
from the code-file CSV (back to the four seeded lists); docs updated.
No PHP changes - the app already requests the BADGE list.

Co-Authored-By: Claude Fable 5 <noreply@anthropic.com>
Claude-Session: https://claude.ai/code/session_01SfunpdkVdapnCdtb2hWS9U
</commit_message>
<xml_diff>
--- a/ReqStation/docs/Requisition Material - Technical Reference.docx
+++ b/ReqStation/docs/Requisition Material - Technical Reference.docx
@@ -592,7 +592,7 @@
               <w:spacing w:after="0"/>
             </w:pPr>
             <w:r>
-              <w:t xml:space="preserve">The code file: all five dropdown lists in one table, keyed by CDTYPE + CDCODE — AREACODE (3), AREATYPE (16), NAMES (65), AUTHBY (6), BADGE (858 active employees: badge # = employee #, name in CDDESC). "Authorization = None" is a REAL AUTHBY row (13k+ historical headers store that literal), sorts first, and is the natural default — nothing synthetic in the code.</w:t>
+              <w:t xml:space="preserve">The code file: the four seeded dropdown lists in one table, keyed by CDTYPE + CDCODE — AREACODE (3), AREATYPE (16), NAMES (65), AUTHBY (6). The BADGE list is not stored here: it reads live from LSCPRDLIB/XEMPLOYP. "Authorization = None" is a REAL AUTHBY row (13k+ historical headers store that literal), sorts first, and is the natural default — nothing synthetic in the code.</w:t>
             </w:r>
           </w:p>
         </w:tc>
@@ -1184,7 +1184,7 @@
               <w:spacing w:after="0"/>
             </w:pPr>
             <w:r>
-              <w:t xml:space="preserve">INTYPE picks the cursor: any code list from RQSCODEFLT; ITEM = autofill from the LSCPRDLIB/ITMMSTP item master (description, coin year) + last-used cost/retail from history, with history fallback for legacy items; ITEMSRCH = type-ahead over LSCPRDLIB/ITMMSTP, first 12, history-enriched.</w:t>
+              <w:t xml:space="preserve">INTYPE picks the cursor: any code list from RQSCODEFLT; BADGE = live active employees (LEESTAT A) from LSCPRDLIB/XEMPLOYP; ITEM = autofill from the LSCPRDLIB/ITMMSTP item master (description, coin year) + last-used cost/retail from history, with history fallback for legacy items; ITEMSRCH = type-ahead over LSCPRDLIB/ITMMSTP, first 12, history-enriched.</w:t>
             </w:r>
           </w:p>
         </w:tc>

</xml_diff>

<commit_message>
Badge list uncapped; Item # opens the item list on click, no arrow
The badge dropdown now shows the whole active-employee list (the menu
scrolls). The Item # box works the same way: clicking in opens the
item list from the top (200 rows per view from REQSTN007S, up from
12), typing narrows it - no arrow button on this one. Enter on an
untouched empty Item # hops fields instead of grabbing the top item.

Co-Authored-By: Claude Fable 5 <noreply@anthropic.com>
Claude-Session: https://claude.ai/code/session_01SfunpdkVdapnCdtb2hWS9U
</commit_message>
<xml_diff>
--- a/ReqStation/docs/Requisition Material - Technical Reference.docx
+++ b/ReqStation/docs/Requisition Material - Technical Reference.docx
@@ -1184,7 +1184,7 @@
               <w:spacing w:after="0"/>
             </w:pPr>
             <w:r>
-              <w:t xml:space="preserve">INTYPE picks the cursor: any code list from RQSCODEFLT; BADGE = live active employees (LEESTAT A) from LSCPRDLIB/XEMPLOYP; ITEM = autofill from the LSCPRDLIB/ITMMSTP item master (description, coin year) + last-used cost/retail from history, with history fallback for legacy items; ITEMSRCH = type-ahead over LSCPRDLIB/ITMMSTP, first 12, history-enriched.</w:t>
+              <w:t xml:space="preserve">INTYPE picks the cursor: any code list from RQSCODEFLT; BADGE = live active employees (LEESTAT A) from LSCPRDLIB/XEMPLOYP; ITEM = autofill from the LSCPRDLIB/ITMMSTP item master (description, coin year) + last-used cost/retail from history, with history fallback for legacy items; ITEMSRCH = the item list from LSCPRDLIB/ITMMSTP (first 200 per prefix), history-enriched.</w:t>
             </w:r>
           </w:p>
         </w:tc>
@@ -1575,7 +1575,7 @@
         <w:t xml:space="preserve">itemsearch</w:t>
       </w:r>
       <w:r>
-        <w:t xml:space="preserve"> (type-ahead, 250ms debounce, 12 rows) both ride REQSTN007S.</w:t>
+        <w:t xml:space="preserve"> (opens on focus with the full list, 250ms debounce while typing, 200 rows per view) both ride REQSTN007S.</w:t>
       </w:r>
     </w:p>
     <w:p>

</xml_diff>